<commit_message>
docs: add application screenshots to the user and admin manuals
Each manual now embeds captioned screenshots of the live UI at the relevant
step: the User manual shows the sign-in screen, the Reports page, the column
chooser, Laporan Sparepart, the Ingestion & Upload page and the dashboard;
the Admin manual shows User Management, the role matrix, notification
routing, Master Data and the Audit Log. Same images across both languages,
captions localised.

Co-Authored-By: Claude Opus 5 <noreply@anthropic.com>
</commit_message>
<xml_diff>
--- a/docs/BC_Inventory_Admin_Manual_EN.docx
+++ b/docs/BC_Inventory_Admin_Manual_EN.docx
@@ -507,6 +507,69 @@
         <w:t xml:space="preserve">Set an initial password that meets the policy (see 2.4), then save.</w:t>
       </w:r>
     </w:p>
+    <w:p>
+      <w:pPr>
+        <w:spacing w:after="20" w:before="80"/>
+        <w:jc w:val="center"/>
+      </w:pPr>
+      <w:r>
+        <w:drawing>
+          <wp:inline distT="0" distB="0" distL="0" distR="0">
+            <wp:extent cx="5943600" cy="3933825"/>
+            <wp:effectExtent t="0" r="0" b="0" l="0"/>
+            <wp:docPr id="1" name="" descr="" title=""/>
+            <wp:cNvGraphicFramePr>
+              <a:graphicFrameLocks xmlns:a="http://schemas.openxmlformats.org/drawingml/2006/main" noChangeAspect="1"/>
+            </wp:cNvGraphicFramePr>
+            <a:graphic xmlns:a="http://schemas.openxmlformats.org/drawingml/2006/main">
+              <a:graphicData uri="http://schemas.openxmlformats.org/drawingml/2006/picture">
+                <pic:pic xmlns:pic="http://schemas.openxmlformats.org/drawingml/2006/picture">
+                  <pic:nvPicPr>
+                    <pic:cNvPr id="0" name="" descr=""/>
+                    <pic:cNvPicPr>
+                      <a:picLocks noChangeAspect="1" noChangeArrowheads="1"/>
+                    </pic:cNvPicPr>
+                  </pic:nvPicPr>
+                  <pic:blipFill>
+                    <a:blip r:embed="rId7" cstate="none"/>
+                    <a:srcRect/>
+                    <a:stretch>
+                      <a:fillRect/>
+                    </a:stretch>
+                  </pic:blipFill>
+                  <pic:spPr bwMode="auto">
+                    <a:xfrm>
+                      <a:off x="0" y="0"/>
+                      <a:ext cx="5943600" cy="3933825"/>
+                    </a:xfrm>
+                    <a:prstGeom prst="rect">
+                      <a:avLst/>
+                    </a:prstGeom>
+                  </pic:spPr>
+                </pic:pic>
+              </a:graphicData>
+            </a:graphic>
+          </wp:inline>
+        </w:drawing>
+      </w:r>
+    </w:p>
+    <w:p>
+      <w:pPr>
+        <w:spacing w:after="160"/>
+        <w:jc w:val="center"/>
+      </w:pPr>
+      <w:r>
+        <w:rPr>
+          <w:rFonts w:ascii="Calibri" w:cs="Calibri" w:eastAsia="Calibri" w:hAnsi="Calibri"/>
+          <w:i/>
+          <w:iCs/>
+          <w:color w:val="6B7683"/>
+          <w:sz w:val="17"/>
+          <w:szCs w:val="17"/>
+        </w:rPr>
+        <w:t xml:space="preserve">Figure 1 — User Management.</w:t>
+      </w:r>
+    </w:p>
     <w:tbl>
       <w:tblPr>
         <w:tblW w:type="dxa" w:w="9700"/>
@@ -889,6 +952,69 @@
     </w:p>
     <w:p>
       <w:pPr>
+        <w:spacing w:after="20" w:before="80"/>
+        <w:jc w:val="center"/>
+      </w:pPr>
+      <w:r>
+        <w:drawing>
+          <wp:inline distT="0" distB="0" distL="0" distR="0">
+            <wp:extent cx="5943600" cy="3933825"/>
+            <wp:effectExtent t="0" r="0" b="0" l="0"/>
+            <wp:docPr id="1" name="" descr="" title=""/>
+            <wp:cNvGraphicFramePr>
+              <a:graphicFrameLocks xmlns:a="http://schemas.openxmlformats.org/drawingml/2006/main" noChangeAspect="1"/>
+            </wp:cNvGraphicFramePr>
+            <a:graphic xmlns:a="http://schemas.openxmlformats.org/drawingml/2006/main">
+              <a:graphicData uri="http://schemas.openxmlformats.org/drawingml/2006/picture">
+                <pic:pic xmlns:pic="http://schemas.openxmlformats.org/drawingml/2006/picture">
+                  <pic:nvPicPr>
+                    <pic:cNvPr id="0" name="" descr=""/>
+                    <pic:cNvPicPr>
+                      <a:picLocks noChangeAspect="1" noChangeArrowheads="1"/>
+                    </pic:cNvPicPr>
+                  </pic:nvPicPr>
+                  <pic:blipFill>
+                    <a:blip r:embed="rId8" cstate="none"/>
+                    <a:srcRect/>
+                    <a:stretch>
+                      <a:fillRect/>
+                    </a:stretch>
+                  </pic:blipFill>
+                  <pic:spPr bwMode="auto">
+                    <a:xfrm>
+                      <a:off x="0" y="0"/>
+                      <a:ext cx="5943600" cy="3933825"/>
+                    </a:xfrm>
+                    <a:prstGeom prst="rect">
+                      <a:avLst/>
+                    </a:prstGeom>
+                  </pic:spPr>
+                </pic:pic>
+              </a:graphicData>
+            </a:graphic>
+          </wp:inline>
+        </w:drawing>
+      </w:r>
+    </w:p>
+    <w:p>
+      <w:pPr>
+        <w:spacing w:after="160"/>
+        <w:jc w:val="center"/>
+      </w:pPr>
+      <w:r>
+        <w:rPr>
+          <w:rFonts w:ascii="Calibri" w:cs="Calibri" w:eastAsia="Calibri" w:hAnsi="Calibri"/>
+          <w:i/>
+          <w:iCs/>
+          <w:color w:val="6B7683"/>
+          <w:sz w:val="17"/>
+          <w:szCs w:val="17"/>
+        </w:rPr>
+        <w:t xml:space="preserve">Figure 2 — the role × page permission matrix.</w:t>
+      </w:r>
+    </w:p>
+    <w:p>
+      <w:pPr>
         <w:pStyle w:val="Heading2"/>
         <w:spacing w:after="120" w:before="220"/>
       </w:pPr>
@@ -1078,6 +1204,69 @@
           <w:szCs w:val="21"/>
         </w:rPr>
         <w:t xml:space="preserve">Changing a box overrides the default for that user and event.</w:t>
+      </w:r>
+    </w:p>
+    <w:p>
+      <w:pPr>
+        <w:spacing w:after="20" w:before="80"/>
+        <w:jc w:val="center"/>
+      </w:pPr>
+      <w:r>
+        <w:drawing>
+          <wp:inline distT="0" distB="0" distL="0" distR="0">
+            <wp:extent cx="5943600" cy="3933825"/>
+            <wp:effectExtent t="0" r="0" b="0" l="0"/>
+            <wp:docPr id="1" name="" descr="" title=""/>
+            <wp:cNvGraphicFramePr>
+              <a:graphicFrameLocks xmlns:a="http://schemas.openxmlformats.org/drawingml/2006/main" noChangeAspect="1"/>
+            </wp:cNvGraphicFramePr>
+            <a:graphic xmlns:a="http://schemas.openxmlformats.org/drawingml/2006/main">
+              <a:graphicData uri="http://schemas.openxmlformats.org/drawingml/2006/picture">
+                <pic:pic xmlns:pic="http://schemas.openxmlformats.org/drawingml/2006/picture">
+                  <pic:nvPicPr>
+                    <pic:cNvPr id="0" name="" descr=""/>
+                    <pic:cNvPicPr>
+                      <a:picLocks noChangeAspect="1" noChangeArrowheads="1"/>
+                    </pic:cNvPicPr>
+                  </pic:nvPicPr>
+                  <pic:blipFill>
+                    <a:blip r:embed="rId9" cstate="none"/>
+                    <a:srcRect/>
+                    <a:stretch>
+                      <a:fillRect/>
+                    </a:stretch>
+                  </pic:blipFill>
+                  <pic:spPr bwMode="auto">
+                    <a:xfrm>
+                      <a:off x="0" y="0"/>
+                      <a:ext cx="5943600" cy="3933825"/>
+                    </a:xfrm>
+                    <a:prstGeom prst="rect">
+                      <a:avLst/>
+                    </a:prstGeom>
+                  </pic:spPr>
+                </pic:pic>
+              </a:graphicData>
+            </a:graphic>
+          </wp:inline>
+        </w:drawing>
+      </w:r>
+    </w:p>
+    <w:p>
+      <w:pPr>
+        <w:spacing w:after="160"/>
+        <w:jc w:val="center"/>
+      </w:pPr>
+      <w:r>
+        <w:rPr>
+          <w:rFonts w:ascii="Calibri" w:cs="Calibri" w:eastAsia="Calibri" w:hAnsi="Calibri"/>
+          <w:i/>
+          <w:iCs/>
+          <w:color w:val="6B7683"/>
+          <w:sz w:val="17"/>
+          <w:szCs w:val="17"/>
+        </w:rPr>
+        <w:t xml:space="preserve">Figure 3 — per-user notification routing.</w:t>
       </w:r>
     </w:p>
     <w:p>
@@ -1302,6 +1491,69 @@
     </w:p>
     <w:p>
       <w:pPr>
+        <w:spacing w:after="20" w:before="80"/>
+        <w:jc w:val="center"/>
+      </w:pPr>
+      <w:r>
+        <w:drawing>
+          <wp:inline distT="0" distB="0" distL="0" distR="0">
+            <wp:extent cx="5943600" cy="3933825"/>
+            <wp:effectExtent t="0" r="0" b="0" l="0"/>
+            <wp:docPr id="1" name="" descr="" title=""/>
+            <wp:cNvGraphicFramePr>
+              <a:graphicFrameLocks xmlns:a="http://schemas.openxmlformats.org/drawingml/2006/main" noChangeAspect="1"/>
+            </wp:cNvGraphicFramePr>
+            <a:graphic xmlns:a="http://schemas.openxmlformats.org/drawingml/2006/main">
+              <a:graphicData uri="http://schemas.openxmlformats.org/drawingml/2006/picture">
+                <pic:pic xmlns:pic="http://schemas.openxmlformats.org/drawingml/2006/picture">
+                  <pic:nvPicPr>
+                    <pic:cNvPr id="0" name="" descr=""/>
+                    <pic:cNvPicPr>
+                      <a:picLocks noChangeAspect="1" noChangeArrowheads="1"/>
+                    </pic:cNvPicPr>
+                  </pic:nvPicPr>
+                  <pic:blipFill>
+                    <a:blip r:embed="rId10" cstate="none"/>
+                    <a:srcRect/>
+                    <a:stretch>
+                      <a:fillRect/>
+                    </a:stretch>
+                  </pic:blipFill>
+                  <pic:spPr bwMode="auto">
+                    <a:xfrm>
+                      <a:off x="0" y="0"/>
+                      <a:ext cx="5943600" cy="3933825"/>
+                    </a:xfrm>
+                    <a:prstGeom prst="rect">
+                      <a:avLst/>
+                    </a:prstGeom>
+                  </pic:spPr>
+                </pic:pic>
+              </a:graphicData>
+            </a:graphic>
+          </wp:inline>
+        </w:drawing>
+      </w:r>
+    </w:p>
+    <w:p>
+      <w:pPr>
+        <w:spacing w:after="160"/>
+        <w:jc w:val="center"/>
+      </w:pPr>
+      <w:r>
+        <w:rPr>
+          <w:rFonts w:ascii="Calibri" w:cs="Calibri" w:eastAsia="Calibri" w:hAnsi="Calibri"/>
+          <w:i/>
+          <w:iCs/>
+          <w:color w:val="6B7683"/>
+          <w:sz w:val="17"/>
+          <w:szCs w:val="17"/>
+        </w:rPr>
+        <w:t xml:space="preserve">Figure 4 — Master Data.</w:t>
+      </w:r>
+    </w:p>
+    <w:p>
+      <w:pPr>
         <w:pStyle w:val="Heading1"/>
         <w:spacing w:after="120" w:before="340"/>
       </w:pPr>
@@ -1534,6 +1786,69 @@
           <w:szCs w:val="21"/>
         </w:rPr>
         <w:t xml:space="preserve">Export the filtered list to CSV if needed.</w:t>
+      </w:r>
+    </w:p>
+    <w:p>
+      <w:pPr>
+        <w:spacing w:after="20" w:before="80"/>
+        <w:jc w:val="center"/>
+      </w:pPr>
+      <w:r>
+        <w:drawing>
+          <wp:inline distT="0" distB="0" distL="0" distR="0">
+            <wp:extent cx="5943600" cy="3933825"/>
+            <wp:effectExtent t="0" r="0" b="0" l="0"/>
+            <wp:docPr id="1" name="" descr="" title=""/>
+            <wp:cNvGraphicFramePr>
+              <a:graphicFrameLocks xmlns:a="http://schemas.openxmlformats.org/drawingml/2006/main" noChangeAspect="1"/>
+            </wp:cNvGraphicFramePr>
+            <a:graphic xmlns:a="http://schemas.openxmlformats.org/drawingml/2006/main">
+              <a:graphicData uri="http://schemas.openxmlformats.org/drawingml/2006/picture">
+                <pic:pic xmlns:pic="http://schemas.openxmlformats.org/drawingml/2006/picture">
+                  <pic:nvPicPr>
+                    <pic:cNvPr id="0" name="" descr=""/>
+                    <pic:cNvPicPr>
+                      <a:picLocks noChangeAspect="1" noChangeArrowheads="1"/>
+                    </pic:cNvPicPr>
+                  </pic:nvPicPr>
+                  <pic:blipFill>
+                    <a:blip r:embed="rId11" cstate="none"/>
+                    <a:srcRect/>
+                    <a:stretch>
+                      <a:fillRect/>
+                    </a:stretch>
+                  </pic:blipFill>
+                  <pic:spPr bwMode="auto">
+                    <a:xfrm>
+                      <a:off x="0" y="0"/>
+                      <a:ext cx="5943600" cy="3933825"/>
+                    </a:xfrm>
+                    <a:prstGeom prst="rect">
+                      <a:avLst/>
+                    </a:prstGeom>
+                  </pic:spPr>
+                </pic:pic>
+              </a:graphicData>
+            </a:graphic>
+          </wp:inline>
+        </w:drawing>
+      </w:r>
+    </w:p>
+    <w:p>
+      <w:pPr>
+        <w:spacing w:after="160"/>
+        <w:jc w:val="center"/>
+      </w:pPr>
+      <w:r>
+        <w:rPr>
+          <w:rFonts w:ascii="Calibri" w:cs="Calibri" w:eastAsia="Calibri" w:hAnsi="Calibri"/>
+          <w:i/>
+          <w:iCs/>
+          <w:color w:val="6B7683"/>
+          <w:sz w:val="17"/>
+          <w:szCs w:val="17"/>
+        </w:rPr>
+        <w:t xml:space="preserve">Figure 5 — the Audit Log.</w:t>
       </w:r>
     </w:p>
     <w:tbl>

</xml_diff>